<commit_message>
docs: remove telas de acesso negado e 404 do protótipo e do relatório
Co-Authored-By: Claude Opus 5.5 <noreply@anthropic.com>
</commit_message>
<xml_diff>
--- a/docs/trabalho-01/Relatorio Trabalho 01 - Skyfare.docx
+++ b/docs/trabalho-01/Relatorio Trabalho 01 - Skyfare.docx
@@ -697,7 +697,7 @@
           <w:sz w:val="24"/>
           <w:szCs w:val="24"/>
         </w:rPr>
-        <w:t xml:space="preserve">4.9 Acesso negado</w:t>
+        <w:t xml:space="preserve">4.9 Versão para celular</w:t>
       </w:r>
       <w:r>
         <w:rPr>
@@ -720,78 +720,22 @@
       <w:r>
         <w:rPr>
           <w:rFonts w:ascii="Arial" w:cs="Arial" w:eastAsia="Arial" w:hAnsi="Arial"/>
-          <w:b w:val="false"/>
-          <w:bCs w:val="false"/>
-          <w:sz w:val="24"/>
-          <w:szCs w:val="24"/>
-        </w:rPr>
-        <w:t xml:space="preserve">4.10 Página não encontrada</w:t>
-      </w:r>
-      <w:r>
-        <w:rPr>
-          <w:rFonts w:ascii="Arial" w:cs="Arial" w:eastAsia="Arial" w:hAnsi="Arial"/>
-          <w:b w:val="false"/>
-          <w:bCs w:val="false"/>
+          <w:b/>
+          <w:bCs/>
+          <w:sz w:val="24"/>
+          <w:szCs w:val="24"/>
+        </w:rPr>
+        <w:t xml:space="preserve">5 FERRAMENTAS E VERSIONAMENTO</w:t>
+      </w:r>
+      <w:r>
+        <w:rPr>
+          <w:rFonts w:ascii="Arial" w:cs="Arial" w:eastAsia="Arial" w:hAnsi="Arial"/>
+          <w:b/>
+          <w:bCs/>
           <w:sz w:val="24"/>
           <w:szCs w:val="24"/>
         </w:rPr>
         <w:t xml:space="preserve">	18</w:t>
-      </w:r>
-    </w:p>
-    <w:p>
-      <w:pPr>
-        <w:tabs>
-          <w:tab w:val="right" w:pos="9071" w:leader="dot"/>
-        </w:tabs>
-        <w:spacing w:line="360"/>
-      </w:pPr>
-      <w:r>
-        <w:rPr>
-          <w:rFonts w:ascii="Arial" w:cs="Arial" w:eastAsia="Arial" w:hAnsi="Arial"/>
-          <w:b w:val="false"/>
-          <w:bCs w:val="false"/>
-          <w:sz w:val="24"/>
-          <w:szCs w:val="24"/>
-        </w:rPr>
-        <w:t xml:space="preserve">4.11 Versão para celular</w:t>
-      </w:r>
-      <w:r>
-        <w:rPr>
-          <w:rFonts w:ascii="Arial" w:cs="Arial" w:eastAsia="Arial" w:hAnsi="Arial"/>
-          <w:b w:val="false"/>
-          <w:bCs w:val="false"/>
-          <w:sz w:val="24"/>
-          <w:szCs w:val="24"/>
-        </w:rPr>
-        <w:t xml:space="preserve">	19</w:t>
-      </w:r>
-    </w:p>
-    <w:p>
-      <w:pPr>
-        <w:tabs>
-          <w:tab w:val="right" w:pos="9071" w:leader="dot"/>
-        </w:tabs>
-        <w:spacing w:line="360"/>
-      </w:pPr>
-      <w:r>
-        <w:rPr>
-          <w:rFonts w:ascii="Arial" w:cs="Arial" w:eastAsia="Arial" w:hAnsi="Arial"/>
-          <w:b/>
-          <w:bCs/>
-          <w:sz w:val="24"/>
-          <w:szCs w:val="24"/>
-        </w:rPr>
-        <w:t xml:space="preserve">5 FERRAMENTAS E VERSIONAMENTO</w:t>
-      </w:r>
-      <w:r>
-        <w:rPr>
-          <w:rFonts w:ascii="Arial" w:cs="Arial" w:eastAsia="Arial" w:hAnsi="Arial"/>
-          <w:b/>
-          <w:bCs/>
-          <w:sz w:val="24"/>
-          <w:szCs w:val="24"/>
-        </w:rPr>
-        <w:t xml:space="preserve">	20</w:t>
       </w:r>
     </w:p>
     <w:p>
@@ -825,7 +769,7 @@
           <w:sz w:val="24"/>
           <w:szCs w:val="24"/>
         </w:rPr>
-        <w:t xml:space="preserve">	21</w:t>
+        <w:t xml:space="preserve">	19</w:t>
       </w:r>
     </w:p>
     <w:p>
@@ -909,7 +853,7 @@
           <w:sz w:val="24"/>
           <w:szCs w:val="24"/>
         </w:rPr>
-        <w:t xml:space="preserve">O protótipo tem 10 telas, além de um guia de estilo e da versão para celular, acima do mínimo de 6 telas recomendado no enunciado.</w:t>
+        <w:t xml:space="preserve">O protótipo tem 8 telas, além de um guia de estilo e da versão para celular, acima do mínimo de 6 telas recomendado no enunciado.</w:t>
       </w:r>
     </w:p>
     <w:p>
@@ -2843,7 +2787,7 @@
           <w:sz w:val="24"/>
           <w:szCs w:val="24"/>
         </w:rPr>
-        <w:t xml:space="preserve">4.9 Acesso negado</w:t>
+        <w:t xml:space="preserve">4.9 Versão para celular</w:t>
       </w:r>
     </w:p>
     <w:p>
@@ -2856,38 +2800,10 @@
       <w:r>
         <w:rPr>
           <w:rFonts w:ascii="Arial" w:cs="Arial" w:eastAsia="Arial" w:hAnsi="Arial"/>
-          <w:b/>
-          <w:bCs/>
-          <w:i w:val="false"/>
-          <w:iCs w:val="false"/>
-          <w:sz w:val="24"/>
-          <w:szCs w:val="24"/>
-        </w:rPr>
-        <w:t xml:space="preserve">Acesso: </w:t>
-      </w:r>
-      <w:r>
-        <w:rPr>
-          <w:rFonts w:ascii="Arial" w:cs="Arial" w:eastAsia="Arial" w:hAnsi="Arial"/>
-          <w:sz w:val="24"/>
-          <w:szCs w:val="24"/>
-        </w:rPr>
-        <w:t xml:space="preserve">pública.</w:t>
-      </w:r>
-    </w:p>
-    <w:p>
-      <w:pPr>
-        <w:keepNext/>
-        <w:spacing w:line="360"/>
-        <w:ind w:firstLine="709"/>
-        <w:jc w:val="both"/>
-      </w:pPr>
-      <w:r>
-        <w:rPr>
-          <w:rFonts w:ascii="Arial" w:cs="Arial" w:eastAsia="Arial" w:hAnsi="Arial"/>
-          <w:sz w:val="24"/>
-          <w:szCs w:val="24"/>
-        </w:rPr>
-        <w:t xml:space="preserve">Exibida quando um usuário tenta abrir uma tela para a qual não tem permissão, como a área de administração (Figura 12). Oferece atalhos para voltar ao início ou entrar com outra conta.</w:t>
+          <w:sz w:val="24"/>
+          <w:szCs w:val="24"/>
+        </w:rPr>
+        <w:t xml:space="preserve">O layout é responsivo. Em telas pequenas, o menu principal vira um botão, os cartões passam a ocupar uma coluna e os filtros se reorganizam, como mostra a Figura 12.</w:t>
       </w:r>
     </w:p>
     <w:p>
@@ -2902,7 +2818,7 @@
           <w:sz w:val="20"/>
           <w:szCs w:val="20"/>
         </w:rPr>
-        <w:t xml:space="preserve">Figura 12 – Tela de acesso negado</w:t>
+        <w:t xml:space="preserve">Figura 12 – Busca rápida e Minhas viagens no celular</w:t>
       </w:r>
     </w:p>
     <w:p>
@@ -2914,7 +2830,7 @@
       <w:r>
         <w:drawing>
           <wp:inline distT="0" distB="0" distL="0" distR="0">
-            <wp:extent cx="5334000" cy="3333750"/>
+            <wp:extent cx="3619500" cy="3638550"/>
             <wp:effectExtent t="0" r="0" b="0" l="0"/>
             <wp:docPr id="12" name="" descr="" title=""/>
             <wp:cNvGraphicFramePr>
@@ -2931,252 +2847,6 @@
                   </pic:nvPicPr>
                   <pic:blipFill>
                     <a:blip r:embed="rId19" cstate="none"/>
-                    <a:srcRect/>
-                    <a:stretch>
-                      <a:fillRect/>
-                    </a:stretch>
-                  </pic:blipFill>
-                  <pic:spPr bwMode="auto">
-                    <a:xfrm>
-                      <a:off x="0" y="0"/>
-                      <a:ext cx="5334000" cy="3333750"/>
-                    </a:xfrm>
-                    <a:prstGeom prst="rect">
-                      <a:avLst/>
-                    </a:prstGeom>
-                  </pic:spPr>
-                </pic:pic>
-              </a:graphicData>
-            </a:graphic>
-          </wp:inline>
-        </w:drawing>
-      </w:r>
-    </w:p>
-    <w:p>
-      <w:pPr>
-        <w:spacing w:after="360" w:before="120" w:line="240"/>
-        <w:jc w:val="center"/>
-      </w:pPr>
-      <w:r>
-        <w:rPr>
-          <w:rFonts w:ascii="Arial" w:cs="Arial" w:eastAsia="Arial" w:hAnsi="Arial"/>
-          <w:sz w:val="20"/>
-          <w:szCs w:val="20"/>
-        </w:rPr>
-        <w:t xml:space="preserve">Fonte: Elaborado pelo autor (2026).</w:t>
-      </w:r>
-    </w:p>
-    <w:p>
-      <w:pPr>
-        <w:pStyle w:val="Heading2"/>
-        <w:keepNext/>
-        <w:spacing w:after="360" w:before="360" w:line="360"/>
-      </w:pPr>
-      <w:r>
-        <w:rPr>
-          <w:rFonts w:ascii="Arial" w:cs="Arial" w:eastAsia="Arial" w:hAnsi="Arial"/>
-          <w:b/>
-          <w:bCs/>
-          <w:sz w:val="24"/>
-          <w:szCs w:val="24"/>
-        </w:rPr>
-        <w:t xml:space="preserve">4.10 Página não encontrada</w:t>
-      </w:r>
-    </w:p>
-    <w:p>
-      <w:pPr>
-        <w:keepNext/>
-        <w:spacing w:line="360"/>
-        <w:ind w:firstLine="709"/>
-        <w:jc w:val="both"/>
-      </w:pPr>
-      <w:r>
-        <w:rPr>
-          <w:rFonts w:ascii="Arial" w:cs="Arial" w:eastAsia="Arial" w:hAnsi="Arial"/>
-          <w:b/>
-          <w:bCs/>
-          <w:i w:val="false"/>
-          <w:iCs w:val="false"/>
-          <w:sz w:val="24"/>
-          <w:szCs w:val="24"/>
-        </w:rPr>
-        <w:t xml:space="preserve">Acesso: </w:t>
-      </w:r>
-      <w:r>
-        <w:rPr>
-          <w:rFonts w:ascii="Arial" w:cs="Arial" w:eastAsia="Arial" w:hAnsi="Arial"/>
-          <w:sz w:val="24"/>
-          <w:szCs w:val="24"/>
-        </w:rPr>
-        <w:t xml:space="preserve">pública.</w:t>
-      </w:r>
-    </w:p>
-    <w:p>
-      <w:pPr>
-        <w:keepNext/>
-        <w:spacing w:line="360"/>
-        <w:ind w:firstLine="709"/>
-        <w:jc w:val="both"/>
-      </w:pPr>
-      <w:r>
-        <w:rPr>
-          <w:rFonts w:ascii="Arial" w:cs="Arial" w:eastAsia="Arial" w:hAnsi="Arial"/>
-          <w:sz w:val="24"/>
-          <w:szCs w:val="24"/>
-        </w:rPr>
-        <w:t xml:space="preserve">Exibida para endereços que não existem (erro 404), com atalhos para a busca de cidades e para a lista de viagens (Figura 13).</w:t>
-      </w:r>
-    </w:p>
-    <w:p>
-      <w:pPr>
-        <w:keepNext/>
-        <w:spacing w:after="120" w:before="360" w:line="240"/>
-        <w:jc w:val="center"/>
-      </w:pPr>
-      <w:r>
-        <w:rPr>
-          <w:rFonts w:ascii="Arial" w:cs="Arial" w:eastAsia="Arial" w:hAnsi="Arial"/>
-          <w:sz w:val="20"/>
-          <w:szCs w:val="20"/>
-        </w:rPr>
-        <w:t xml:space="preserve">Figura 13 – Tela de página não encontrada</w:t>
-      </w:r>
-    </w:p>
-    <w:p>
-      <w:pPr>
-        <w:keepNext/>
-        <w:spacing w:line="240"/>
-        <w:jc w:val="center"/>
-      </w:pPr>
-      <w:r>
-        <w:drawing>
-          <wp:inline distT="0" distB="0" distL="0" distR="0">
-            <wp:extent cx="5334000" cy="3333750"/>
-            <wp:effectExtent t="0" r="0" b="0" l="0"/>
-            <wp:docPr id="13" name="" descr="" title=""/>
-            <wp:cNvGraphicFramePr>
-              <a:graphicFrameLocks xmlns:a="http://schemas.openxmlformats.org/drawingml/2006/main" noChangeAspect="1"/>
-            </wp:cNvGraphicFramePr>
-            <a:graphic xmlns:a="http://schemas.openxmlformats.org/drawingml/2006/main">
-              <a:graphicData uri="http://schemas.openxmlformats.org/drawingml/2006/picture">
-                <pic:pic xmlns:pic="http://schemas.openxmlformats.org/drawingml/2006/picture">
-                  <pic:nvPicPr>
-                    <pic:cNvPr id="0" name="" descr=""/>
-                    <pic:cNvPicPr>
-                      <a:picLocks noChangeAspect="1" noChangeArrowheads="1"/>
-                    </pic:cNvPicPr>
-                  </pic:nvPicPr>
-                  <pic:blipFill>
-                    <a:blip r:embed="rId20" cstate="none"/>
-                    <a:srcRect/>
-                    <a:stretch>
-                      <a:fillRect/>
-                    </a:stretch>
-                  </pic:blipFill>
-                  <pic:spPr bwMode="auto">
-                    <a:xfrm>
-                      <a:off x="0" y="0"/>
-                      <a:ext cx="5334000" cy="3333750"/>
-                    </a:xfrm>
-                    <a:prstGeom prst="rect">
-                      <a:avLst/>
-                    </a:prstGeom>
-                  </pic:spPr>
-                </pic:pic>
-              </a:graphicData>
-            </a:graphic>
-          </wp:inline>
-        </w:drawing>
-      </w:r>
-    </w:p>
-    <w:p>
-      <w:pPr>
-        <w:spacing w:after="360" w:before="120" w:line="240"/>
-        <w:jc w:val="center"/>
-      </w:pPr>
-      <w:r>
-        <w:rPr>
-          <w:rFonts w:ascii="Arial" w:cs="Arial" w:eastAsia="Arial" w:hAnsi="Arial"/>
-          <w:sz w:val="20"/>
-          <w:szCs w:val="20"/>
-        </w:rPr>
-        <w:t xml:space="preserve">Fonte: Elaborado pelo autor (2026).</w:t>
-      </w:r>
-    </w:p>
-    <w:p>
-      <w:pPr>
-        <w:pStyle w:val="Heading2"/>
-        <w:keepNext/>
-        <w:spacing w:after="360" w:before="360" w:line="360"/>
-      </w:pPr>
-      <w:r>
-        <w:rPr>
-          <w:rFonts w:ascii="Arial" w:cs="Arial" w:eastAsia="Arial" w:hAnsi="Arial"/>
-          <w:b/>
-          <w:bCs/>
-          <w:sz w:val="24"/>
-          <w:szCs w:val="24"/>
-        </w:rPr>
-        <w:t xml:space="preserve">4.11 Versão para celular</w:t>
-      </w:r>
-    </w:p>
-    <w:p>
-      <w:pPr>
-        <w:keepNext/>
-        <w:spacing w:line="360"/>
-        <w:ind w:firstLine="709"/>
-        <w:jc w:val="both"/>
-      </w:pPr>
-      <w:r>
-        <w:rPr>
-          <w:rFonts w:ascii="Arial" w:cs="Arial" w:eastAsia="Arial" w:hAnsi="Arial"/>
-          <w:sz w:val="24"/>
-          <w:szCs w:val="24"/>
-        </w:rPr>
-        <w:t xml:space="preserve">O layout é responsivo. Em telas pequenas, o menu principal vira um botão, os cartões passam a ocupar uma coluna e os filtros se reorganizam, como mostra a Figura 14.</w:t>
-      </w:r>
-    </w:p>
-    <w:p>
-      <w:pPr>
-        <w:keepNext/>
-        <w:spacing w:after="120" w:before="360" w:line="240"/>
-        <w:jc w:val="center"/>
-      </w:pPr>
-      <w:r>
-        <w:rPr>
-          <w:rFonts w:ascii="Arial" w:cs="Arial" w:eastAsia="Arial" w:hAnsi="Arial"/>
-          <w:sz w:val="20"/>
-          <w:szCs w:val="20"/>
-        </w:rPr>
-        <w:t xml:space="preserve">Figura 14 – Busca rápida e Minhas viagens no celular</w:t>
-      </w:r>
-    </w:p>
-    <w:p>
-      <w:pPr>
-        <w:keepNext/>
-        <w:spacing w:line="240"/>
-        <w:jc w:val="center"/>
-      </w:pPr>
-      <w:r>
-        <w:drawing>
-          <wp:inline distT="0" distB="0" distL="0" distR="0">
-            <wp:extent cx="3619500" cy="3638550"/>
-            <wp:effectExtent t="0" r="0" b="0" l="0"/>
-            <wp:docPr id="14" name="" descr="" title=""/>
-            <wp:cNvGraphicFramePr>
-              <a:graphicFrameLocks xmlns:a="http://schemas.openxmlformats.org/drawingml/2006/main" noChangeAspect="1"/>
-            </wp:cNvGraphicFramePr>
-            <a:graphic xmlns:a="http://schemas.openxmlformats.org/drawingml/2006/main">
-              <a:graphicData uri="http://schemas.openxmlformats.org/drawingml/2006/picture">
-                <pic:pic xmlns:pic="http://schemas.openxmlformats.org/drawingml/2006/picture">
-                  <pic:nvPicPr>
-                    <pic:cNvPr id="0" name="" descr=""/>
-                    <pic:cNvPicPr>
-                      <a:picLocks noChangeAspect="1" noChangeArrowheads="1"/>
-                    </pic:cNvPicPr>
-                  </pic:nvPicPr>
-                  <pic:blipFill>
-                    <a:blip r:embed="rId21" cstate="none"/>
                     <a:srcRect/>
                     <a:stretch>
                       <a:fillRect/>

</xml_diff>